<commit_message>
version final de la partie 1
</commit_message>
<xml_diff>
--- a/Prompt_Conception_Base.docx
+++ b/Prompt_Conception_Base.docx
@@ -1,6 +1,6 @@
 
 <file path=word/document.xml><?xml version="1.0" encoding="utf-8"?>
-<w:document xmlns:wpc="http://schemas.microsoft.com/office/word/2010/wordprocessingCanvas" xmlns:cx="http://schemas.microsoft.com/office/drawing/2014/chartex" xmlns:cx1="http://schemas.microsoft.com/office/drawing/2015/9/8/chartex" xmlns:cx2="http://schemas.microsoft.com/office/drawing/2015/10/21/chartex" xmlns:cx3="http://schemas.microsoft.com/office/drawing/2016/5/9/chartex" xmlns:cx4="http://schemas.microsoft.com/office/drawing/2016/5/10/chartex" xmlns:cx5="http://schemas.microsoft.com/office/drawing/2016/5/11/chartex" xmlns:cx6="http://schemas.microsoft.com/office/drawing/2016/5/12/chartex" xmlns:cx7="http://schemas.microsoft.com/office/drawing/2016/5/13/chartex" xmlns:cx8="http://schemas.microsoft.com/office/drawing/2016/5/14/chartex" xmlns:mc="http://schemas.openxmlformats.org/markup-compatibility/2006" xmlns:aink="http://schemas.microsoft.com/office/drawing/2016/ink" xmlns:am3d="http://schemas.microsoft.com/office/drawing/2017/model3d" xmlns:o="urn:schemas-microsoft-com:office:office" xmlns:oel="http://schemas.microsoft.com/office/2019/extlst" xmlns:r="http://schemas.openxmlformats.org/officeDocument/2006/relationships" xmlns:m="http://schemas.openxmlformats.org/officeDocument/2006/math" xmlns:v="urn:schemas-microsoft-com:vml" xmlns:wp14="http://schemas.microsoft.com/office/word/2010/wordprocessingDrawing" xmlns:wp="http://schemas.openxmlformats.org/drawingml/2006/wordprocessingDrawing" xmlns:w10="urn:schemas-microsoft-com:office:word" xmlns:w="http://schemas.openxmlformats.org/wordprocessingml/2006/main" xmlns:w14="http://schemas.microsoft.com/office/word/2010/wordml" xmlns:w15="http://schemas.microsoft.com/office/word/2012/wordml" xmlns:w16cex="http://schemas.microsoft.com/office/word/2018/wordml/cex" xmlns:w16cid="http://schemas.microsoft.com/office/word/2016/wordml/cid" xmlns:w16="http://schemas.microsoft.com/office/word/2018/wordml" xmlns:w16du="http://schemas.microsoft.com/office/word/2023/wordml/word16du" xmlns:w16sdtdh="http://schemas.microsoft.com/office/word/2020/wordml/sdtdatahash" xmlns:w16se="http://schemas.microsoft.com/office/word/2015/wordml/symex" xmlns:wpg="http://schemas.microsoft.com/office/word/2010/wordprocessingGroup" xmlns:wpi="http://schemas.microsoft.com/office/word/2010/wordprocessingInk" xmlns:wne="http://schemas.microsoft.com/office/word/2006/wordml" xmlns:wps="http://schemas.microsoft.com/office/word/2010/wordprocessingShape" mc:Ignorable="w14 w15 w16se w16cid w16 w16cex w16sdtdh w16du wp14">
+<w:document xmlns:wpc="http://schemas.microsoft.com/office/word/2010/wordprocessingCanvas" xmlns:cx="http://schemas.microsoft.com/office/drawing/2014/chartex" xmlns:cx1="http://schemas.microsoft.com/office/drawing/2015/9/8/chartex" xmlns:cx2="http://schemas.microsoft.com/office/drawing/2015/10/21/chartex" xmlns:cx3="http://schemas.microsoft.com/office/drawing/2016/5/9/chartex" xmlns:cx4="http://schemas.microsoft.com/office/drawing/2016/5/10/chartex" xmlns:cx5="http://schemas.microsoft.com/office/drawing/2016/5/11/chartex" xmlns:cx6="http://schemas.microsoft.com/office/drawing/2016/5/12/chartex" xmlns:cx7="http://schemas.microsoft.com/office/drawing/2016/5/13/chartex" xmlns:cx8="http://schemas.microsoft.com/office/drawing/2016/5/14/chartex" xmlns:mc="http://schemas.openxmlformats.org/markup-compatibility/2006" xmlns:aink="http://schemas.microsoft.com/office/drawing/2016/ink" xmlns:am3d="http://schemas.microsoft.com/office/drawing/2017/model3d" xmlns:o="urn:schemas-microsoft-com:office:office" xmlns:oel="http://schemas.microsoft.com/office/2019/extlst" xmlns:r="http://schemas.openxmlformats.org/officeDocument/2006/relationships" xmlns:m="http://schemas.openxmlformats.org/officeDocument/2006/math" xmlns:v="urn:schemas-microsoft-com:vml" xmlns:wp14="http://schemas.microsoft.com/office/word/2010/wordprocessingDrawing" xmlns:wp="http://schemas.openxmlformats.org/drawingml/2006/wordprocessingDrawing" xmlns:w10="urn:schemas-microsoft-com:office:word" xmlns:w="http://schemas.openxmlformats.org/wordprocessingml/2006/main" xmlns:w14="http://schemas.microsoft.com/office/word/2010/wordml" xmlns:w15="http://schemas.microsoft.com/office/word/2012/wordml" xmlns:w16cex="http://schemas.microsoft.com/office/word/2018/wordml/cex" xmlns:w16cid="http://schemas.microsoft.com/office/word/2016/wordml/cid" xmlns:w16="http://schemas.microsoft.com/office/word/2018/wordml" xmlns:w16du="http://schemas.microsoft.com/office/word/2023/wordml/word16du" xmlns:w16sdtdh="http://schemas.microsoft.com/office/word/2020/wordml/sdtdatahash" xmlns:w16sdtfl="http://schemas.microsoft.com/office/word/2024/wordml/sdtformatlock" xmlns:w16se="http://schemas.microsoft.com/office/word/2015/wordml/symex" xmlns:wpg="http://schemas.microsoft.com/office/word/2010/wordprocessingGroup" xmlns:wpi="http://schemas.microsoft.com/office/word/2010/wordprocessingInk" xmlns:wne="http://schemas.microsoft.com/office/word/2006/wordml" xmlns:wps="http://schemas.microsoft.com/office/word/2010/wordprocessingShape" mc:Ignorable="w14 w15 w16se w16cid w16 w16cex w16sdtdh w16sdtfl w16du wp14">
   <w:body>
     <w:p>
       <w:pPr>
@@ -16,7 +16,43 @@
         <w:rPr>
           <w:highlight w:val="green"/>
         </w:rPr>
-        <w:t>[A COMPLETER]</w:t>
+        <w:t>[</w:t>
+      </w:r>
+      <w:r>
+        <w:rPr>
+          <w:highlight w:val="green"/>
+        </w:rPr>
+        <w:t>Sport </w:t>
+      </w:r>
+      <w:r>
+        <w:t>/</w:t>
+      </w:r>
+      <w:proofErr w:type="spellStart"/>
+      <w:r>
+        <w:t>jiu</w:t>
+      </w:r>
+      <w:proofErr w:type="spellEnd"/>
+      <w:r>
+        <w:t xml:space="preserve"> </w:t>
+      </w:r>
+      <w:proofErr w:type="spellStart"/>
+      <w:r>
+        <w:t>jitsu</w:t>
+      </w:r>
+      <w:proofErr w:type="spellEnd"/>
+      <w:r>
+        <w:t xml:space="preserve"> </w:t>
+      </w:r>
+      <w:proofErr w:type="spellStart"/>
+      <w:r>
+        <w:t>bresilien</w:t>
+      </w:r>
+      <w:proofErr w:type="spellEnd"/>
+      <w:r>
+        <w:rPr>
+          <w:highlight w:val="green"/>
+        </w:rPr>
+        <w:t>]</w:t>
       </w:r>
       <w:r>
         <w:t xml:space="preserve">. Ton </w:t>
@@ -276,8 +312,236 @@
         <w:t>es règles de gestion</w:t>
       </w:r>
       <w:r>
-        <w:t xml:space="preserve"> et le dictionnaire de données.</w:t>
-      </w:r>
+        <w:t xml:space="preserve"> et le dictionnaire de données</w:t>
+      </w:r>
+    </w:p>
+    <w:p>
+      <w:pPr>
+        <w:jc w:val="both"/>
+      </w:pPr>
+    </w:p>
+    <w:p>
+      <w:pPr>
+        <w:jc w:val="both"/>
+      </w:pPr>
+    </w:p>
+    <w:p>
+      <w:pPr>
+        <w:jc w:val="both"/>
+      </w:pPr>
+    </w:p>
+    <w:p>
+      <w:pPr>
+        <w:jc w:val="both"/>
+      </w:pPr>
+    </w:p>
+    <w:p>
+      <w:pPr>
+        <w:jc w:val="both"/>
+      </w:pPr>
+      <w:r>
+        <w:t>Tu travailles dans le domaine du Sport / Jiu-Jitsu Brésilien (JJB). Ton organisation sportive internationale spécialisée en Jiu-Jitsu Brésilien a comme activité principale l’organisation et la gestion de compétitions officielles nationales et internationales, la gestion des classements des athlètes, le suivi des grades (ceintures), l’affiliation des clubs et l’enregistrement des résultats sportifs.</w:t>
+      </w:r>
+    </w:p>
+    <w:p>
+      <w:pPr>
+        <w:jc w:val="both"/>
+      </w:pPr>
+      <w:r>
+        <w:t xml:space="preserve">C’est une organisation comparable à la International </w:t>
+      </w:r>
+      <w:proofErr w:type="spellStart"/>
+      <w:r>
+        <w:t>Brazilian</w:t>
+      </w:r>
+      <w:proofErr w:type="spellEnd"/>
+      <w:r>
+        <w:t xml:space="preserve"> Jiu-Jitsu </w:t>
+      </w:r>
+      <w:proofErr w:type="spellStart"/>
+      <w:r>
+        <w:t>Federation</w:t>
+      </w:r>
+      <w:proofErr w:type="spellEnd"/>
+      <w:r>
+        <w:t xml:space="preserve"> (IBJJF) ou à la International Judo </w:t>
+      </w:r>
+      <w:proofErr w:type="spellStart"/>
+      <w:r>
+        <w:t>Federation</w:t>
+      </w:r>
+      <w:proofErr w:type="spellEnd"/>
+      <w:r>
+        <w:t xml:space="preserve"> (IJF), qui encadrent et réglementent leur discipline au niveau mondial.</w:t>
+      </w:r>
+    </w:p>
+    <w:p>
+      <w:pPr>
+        <w:jc w:val="both"/>
+      </w:pPr>
+    </w:p>
+    <w:p>
+      <w:pPr>
+        <w:jc w:val="both"/>
+      </w:pPr>
+      <w:r>
+        <w:lastRenderedPageBreak/>
+        <w:t>Les données ont été collectées à partir :</w:t>
+      </w:r>
+    </w:p>
+    <w:p>
+      <w:pPr>
+        <w:jc w:val="both"/>
+      </w:pPr>
+    </w:p>
+    <w:p>
+      <w:pPr>
+        <w:jc w:val="both"/>
+      </w:pPr>
+      <w:proofErr w:type="gramStart"/>
+      <w:r>
+        <w:t>des</w:t>
+      </w:r>
+      <w:proofErr w:type="gramEnd"/>
+      <w:r>
+        <w:t xml:space="preserve"> formulaires d’inscription des athlètes aux compétitions,</w:t>
+      </w:r>
+    </w:p>
+    <w:p>
+      <w:pPr>
+        <w:jc w:val="both"/>
+      </w:pPr>
+      <w:proofErr w:type="gramStart"/>
+      <w:r>
+        <w:t>des</w:t>
+      </w:r>
+      <w:proofErr w:type="gramEnd"/>
+      <w:r>
+        <w:t xml:space="preserve"> dossiers d’affiliation des clubs,</w:t>
+      </w:r>
+    </w:p>
+    <w:p>
+      <w:pPr>
+        <w:jc w:val="both"/>
+      </w:pPr>
+      <w:proofErr w:type="gramStart"/>
+      <w:r>
+        <w:t>des</w:t>
+      </w:r>
+      <w:proofErr w:type="gramEnd"/>
+      <w:r>
+        <w:t xml:space="preserve"> feuilles officielles de résultats des combats,</w:t>
+      </w:r>
+    </w:p>
+    <w:p>
+      <w:pPr>
+        <w:jc w:val="both"/>
+      </w:pPr>
+      <w:proofErr w:type="gramStart"/>
+      <w:r>
+        <w:t>des</w:t>
+      </w:r>
+      <w:proofErr w:type="gramEnd"/>
+      <w:r>
+        <w:t xml:space="preserve"> tableaux de classement par saison,</w:t>
+      </w:r>
+    </w:p>
+    <w:p>
+      <w:pPr>
+        <w:jc w:val="both"/>
+      </w:pPr>
+      <w:proofErr w:type="gramStart"/>
+      <w:r>
+        <w:t>des</w:t>
+      </w:r>
+      <w:proofErr w:type="gramEnd"/>
+      <w:r>
+        <w:t xml:space="preserve"> règlements sportifs concernant les catégories de poids et de ceinture,</w:t>
+      </w:r>
+    </w:p>
+    <w:p>
+      <w:pPr>
+        <w:jc w:val="both"/>
+      </w:pPr>
+      <w:proofErr w:type="gramStart"/>
+      <w:r>
+        <w:t>des</w:t>
+      </w:r>
+      <w:proofErr w:type="gramEnd"/>
+      <w:r>
+        <w:t xml:space="preserve"> historiques de promotions de grade (changement de ceinture).</w:t>
+      </w:r>
+    </w:p>
+    <w:p>
+      <w:pPr>
+        <w:jc w:val="both"/>
+      </w:pPr>
+      <w:r>
+        <w:t xml:space="preserve">Inspire-toi du site officiel de la International </w:t>
+      </w:r>
+      <w:proofErr w:type="spellStart"/>
+      <w:r>
+        <w:t>Brazilian</w:t>
+      </w:r>
+      <w:proofErr w:type="spellEnd"/>
+      <w:r>
+        <w:t xml:space="preserve"> Jiu-Jitsu </w:t>
+      </w:r>
+      <w:proofErr w:type="spellStart"/>
+      <w:r>
+        <w:t>Federation</w:t>
+      </w:r>
+      <w:proofErr w:type="spellEnd"/>
+      <w:r>
+        <w:t>, notamment des sections relatives aux compétitions, aux classements mondiaux et aux règlements sportifs.</w:t>
+      </w:r>
+    </w:p>
+    <w:p>
+      <w:pPr>
+        <w:jc w:val="both"/>
+      </w:pPr>
+      <w:r>
+        <w:t>Ton organisation sportive souhaite appliquer la méthode MERISE afin de concevoir un système d’information permettant de gérer efficacement l’ensemble de ces données. Tu es chargé de la phase d’analyse, c’est-à-dire de recueillir et formaliser les besoins auprès des responsables de l’organisation.</w:t>
+      </w:r>
+    </w:p>
+    <w:p>
+      <w:pPr>
+        <w:jc w:val="both"/>
+      </w:pPr>
+      <w:r>
+        <w:t>Elle doit correspondre aux informations que fournit quelqu’un qui connaît le fonctionnement de l’entreprise, mais pas comment se construit un système d’information.</w:t>
+      </w:r>
+    </w:p>
+    <w:p>
+      <w:pPr>
+        <w:jc w:val="both"/>
+      </w:pPr>
+    </w:p>
+    <w:p>
+      <w:pPr>
+        <w:jc w:val="both"/>
+      </w:pPr>
+    </w:p>
+    <w:p>
+      <w:pPr>
+        <w:jc w:val="both"/>
+      </w:pPr>
+      <w:r>
+        <w:t>Ensuite, à partir de ces règles, fournis un dictionnaire de données brutes avec les colonnes suivantes, regroupées dans un tableau : signification de la donnée, type, taille en nombre de caractères ou de chiffres. Il doit y avoir entre 25 et 35 données. Il sert à fournir des informations supplémentaires sur chaque donnée (taille et type) mais sans a priori sur comment les données vont être modélisées ensuite.</w:t>
+      </w:r>
+    </w:p>
+    <w:p>
+      <w:pPr>
+        <w:jc w:val="both"/>
+      </w:pPr>
+      <w:r>
+        <w:t>Fournis donc les règles de gestion et le dictionnaire de données</w:t>
+      </w:r>
+    </w:p>
+    <w:p>
+      <w:pPr>
+        <w:jc w:val="both"/>
+      </w:pPr>
     </w:p>
     <w:sectPr>
       <w:pgSz w:w="11906" w:h="16838"/>
@@ -290,7 +554,7 @@
 </file>
 
 <file path=word/styles.xml><?xml version="1.0" encoding="utf-8"?>
-<w:styles xmlns:mc="http://schemas.openxmlformats.org/markup-compatibility/2006" xmlns:r="http://schemas.openxmlformats.org/officeDocument/2006/relationships" xmlns:w="http://schemas.openxmlformats.org/wordprocessingml/2006/main" xmlns:w14="http://schemas.microsoft.com/office/word/2010/wordml" xmlns:w15="http://schemas.microsoft.com/office/word/2012/wordml" xmlns:w16cex="http://schemas.microsoft.com/office/word/2018/wordml/cex" xmlns:w16cid="http://schemas.microsoft.com/office/word/2016/wordml/cid" xmlns:w16="http://schemas.microsoft.com/office/word/2018/wordml" xmlns:w16du="http://schemas.microsoft.com/office/word/2023/wordml/word16du" xmlns:w16sdtdh="http://schemas.microsoft.com/office/word/2020/wordml/sdtdatahash" xmlns:w16se="http://schemas.microsoft.com/office/word/2015/wordml/symex" mc:Ignorable="w14 w15 w16se w16cid w16 w16cex w16sdtdh w16du">
+<w:styles xmlns:mc="http://schemas.openxmlformats.org/markup-compatibility/2006" xmlns:r="http://schemas.openxmlformats.org/officeDocument/2006/relationships" xmlns:w="http://schemas.openxmlformats.org/wordprocessingml/2006/main" xmlns:w14="http://schemas.microsoft.com/office/word/2010/wordml" xmlns:w15="http://schemas.microsoft.com/office/word/2012/wordml" xmlns:w16cex="http://schemas.microsoft.com/office/word/2018/wordml/cex" xmlns:w16cid="http://schemas.microsoft.com/office/word/2016/wordml/cid" xmlns:w16="http://schemas.microsoft.com/office/word/2018/wordml" xmlns:w16du="http://schemas.microsoft.com/office/word/2023/wordml/word16du" xmlns:w16sdtdh="http://schemas.microsoft.com/office/word/2020/wordml/sdtdatahash" xmlns:w16sdtfl="http://schemas.microsoft.com/office/word/2024/wordml/sdtformatlock" xmlns:w16se="http://schemas.microsoft.com/office/word/2015/wordml/symex" mc:Ignorable="w14 w15 w16se w16cid w16 w16cex w16sdtdh w16sdtfl w16du">
   <w:docDefaults>
     <w:rPrDefault>
       <w:rPr>

</xml_diff>